<commit_message>
More reorg. Also started a deprecated folder to store dead documents that need inspection prior to deletion.
</commit_message>
<xml_diff>
--- a/assets/docs/UWPR_Resources_for_Grant_Writing.docx
+++ b/assets/docs/UWPR_Resources_for_Grant_Writing.docx
@@ -191,7 +191,31 @@
         <w:rPr>
           <w:szCs w:val="20"/>
         </w:rPr>
-        <w:t>The Proteomics Resource’s laboratory is equipped with six mass spectrometers from ThermoFisher. We have f</w:t>
+        <w:t>The Proteomics Resource’s laboratory is equipped with six mass spectrometers from Thermo</w:t>
+      </w:r>
+      <w:r>
+        <w:rPr>
+          <w:szCs w:val="20"/>
+        </w:rPr>
+        <w:t xml:space="preserve"> </w:t>
+      </w:r>
+      <w:r>
+        <w:rPr>
+          <w:szCs w:val="20"/>
+        </w:rPr>
+        <w:t>Fisher</w:t>
+      </w:r>
+      <w:r>
+        <w:rPr>
+          <w:szCs w:val="20"/>
+        </w:rPr>
+        <w:t xml:space="preserve"> Scientific</w:t>
+      </w:r>
+      <w:r>
+        <w:rPr>
+          <w:szCs w:val="20"/>
+        </w:rPr>
+        <w:t>. We have f</w:t>
       </w:r>
       <w:r>
         <w:rPr>
@@ -203,7 +227,19 @@
         <w:rPr>
           <w:szCs w:val="20"/>
         </w:rPr>
-        <w:t xml:space="preserve"> ultra-high performance MS systems an </w:t>
+        <w:t xml:space="preserve"> ultra-high performance MS systems</w:t>
+      </w:r>
+      <w:r>
+        <w:rPr>
+          <w:szCs w:val="20"/>
+        </w:rPr>
+        <w:t>:</w:t>
+      </w:r>
+      <w:r>
+        <w:rPr>
+          <w:szCs w:val="20"/>
+        </w:rPr>
+        <w:t xml:space="preserve"> an </w:t>
       </w:r>
       <w:r>
         <w:rPr>
@@ -251,7 +287,13 @@
         <w:rPr>
           <w:szCs w:val="20"/>
         </w:rPr>
-        <w:t xml:space="preserve">, as well as </w:t>
+        <w:t>. We also have</w:t>
+      </w:r>
+      <w:r>
+        <w:rPr>
+          <w:szCs w:val="20"/>
+        </w:rPr>
+        <w:t xml:space="preserve"> </w:t>
       </w:r>
       <w:r>
         <w:rPr>
@@ -263,16 +305,14 @@
         <w:rPr>
           <w:szCs w:val="20"/>
         </w:rPr>
-        <w:t xml:space="preserve"> triple quadrupole mass </w:t>
-      </w:r>
-      <w:proofErr w:type="gramStart"/>
-      <w:r>
-        <w:rPr>
-          <w:szCs w:val="20"/>
-        </w:rPr>
-        <w:t>spectrometers</w:t>
-      </w:r>
-      <w:proofErr w:type="gramEnd"/>
+        <w:t xml:space="preserve"> triple quadrupole mass spectrometer</w:t>
+      </w:r>
+      <w:r>
+        <w:rPr>
+          <w:szCs w:val="20"/>
+        </w:rPr>
+        <w:t>:</w:t>
+      </w:r>
       <w:r>
         <w:rPr>
           <w:szCs w:val="20"/>
@@ -315,7 +355,6 @@
         </w:rPr>
         <w:t xml:space="preserve">designed </w:t>
       </w:r>
-      <w:proofErr w:type="spellStart"/>
       <w:r>
         <w:rPr>
           <w:szCs w:val="20"/>
@@ -326,14 +365,7 @@
         <w:rPr>
           <w:szCs w:val="20"/>
         </w:rPr>
-        <w:t>spray</w:t>
-      </w:r>
-      <w:proofErr w:type="spellEnd"/>
-      <w:r>
-        <w:rPr>
-          <w:szCs w:val="20"/>
-        </w:rPr>
-        <w:t xml:space="preserve"> ionization source</w:t>
+        <w:t>spray ionization source</w:t>
       </w:r>
       <w:r>
         <w:rPr>
@@ -437,7 +469,19 @@
         <w:rPr>
           <w:szCs w:val="20"/>
         </w:rPr>
-        <w:t xml:space="preserve">a ThermoFisher speedvac </w:t>
+        <w:t xml:space="preserve">a </w:t>
+      </w:r>
+      <w:r>
+        <w:rPr>
+          <w:szCs w:val="20"/>
+        </w:rPr>
+        <w:t>Thermo Fisher Scientific</w:t>
+      </w:r>
+      <w:r>
+        <w:rPr>
+          <w:szCs w:val="20"/>
+        </w:rPr>
+        <w:t xml:space="preserve"> speedvac </w:t>
       </w:r>
       <w:r>
         <w:rPr>
@@ -579,55 +623,7 @@
           <w:rFonts w:cs="Arial"/>
           <w:szCs w:val="20"/>
         </w:rPr>
-        <w:t xml:space="preserve">Support services/facilities within SLU campus include cold rooms, tissue culture rooms, radioisotope areas, dark rooms, </w:t>
-      </w:r>
-      <w:proofErr w:type="gramStart"/>
-      <w:r>
-        <w:rPr>
-          <w:rFonts w:cs="Arial"/>
-          <w:szCs w:val="20"/>
-        </w:rPr>
-        <w:t>autoclave</w:t>
-      </w:r>
-      <w:proofErr w:type="gramEnd"/>
-      <w:r>
-        <w:rPr>
-          <w:rFonts w:cs="Arial"/>
-          <w:szCs w:val="20"/>
-        </w:rPr>
-        <w:t xml:space="preserve">, media preparation </w:t>
-      </w:r>
-      <w:proofErr w:type="gramStart"/>
-      <w:r>
-        <w:rPr>
-          <w:rFonts w:cs="Arial"/>
-          <w:szCs w:val="20"/>
-        </w:rPr>
-        <w:t>room</w:t>
-      </w:r>
-      <w:proofErr w:type="gramEnd"/>
-      <w:r>
-        <w:rPr>
-          <w:rFonts w:cs="Arial"/>
-          <w:szCs w:val="20"/>
-        </w:rPr>
-        <w:t xml:space="preserve"> and freezer </w:t>
-      </w:r>
-      <w:proofErr w:type="gramStart"/>
-      <w:r>
-        <w:rPr>
-          <w:rFonts w:cs="Arial"/>
-          <w:szCs w:val="20"/>
-        </w:rPr>
-        <w:t>farm</w:t>
-      </w:r>
-      <w:proofErr w:type="gramEnd"/>
-      <w:r>
-        <w:rPr>
-          <w:rFonts w:cs="Arial"/>
-          <w:szCs w:val="20"/>
-        </w:rPr>
-        <w:t>.  It provides shared equipment such as deionized/reverse osmosis water, distillation, gel imagers, film developers, scintillation counters, centrifuges and ultra centrifuges.  Additionally</w:t>
+        <w:t>Support services/facilities within SLU campus include cold rooms, tissue culture rooms, radioisotope areas, dark rooms, autoclave, media preparation room and freezer farm.  It provides shared equipment such as deionized/reverse osmosis water, distillation, gel imagers, film developers, scintillation counters, centrifuges and ultra centrifuges.  Additionally</w:t>
       </w:r>
       <w:r>
         <w:rPr>
@@ -871,35 +867,7 @@
         <w:rPr>
           <w:szCs w:val="20"/>
         </w:rPr>
-        <w:t xml:space="preserve">department has a dedicated data center with redundant cooling, UPS/Generator </w:t>
-      </w:r>
-      <w:proofErr w:type="gramStart"/>
-      <w:r>
-        <w:rPr>
-          <w:szCs w:val="20"/>
-        </w:rPr>
-        <w:t>backed</w:t>
-      </w:r>
-      <w:proofErr w:type="gramEnd"/>
-      <w:r>
-        <w:rPr>
-          <w:szCs w:val="20"/>
-        </w:rPr>
-        <w:t xml:space="preserve"> power, gas fire suppression, seismically braced racks, and </w:t>
-      </w:r>
-      <w:proofErr w:type="gramStart"/>
-      <w:r>
-        <w:rPr>
-          <w:szCs w:val="20"/>
-        </w:rPr>
-        <w:t>key-card</w:t>
-      </w:r>
-      <w:proofErr w:type="gramEnd"/>
-      <w:r>
-        <w:rPr>
-          <w:szCs w:val="20"/>
-        </w:rPr>
-        <w:t xml:space="preserve"> controlled access. We have a departmental IT support team of 7 professionals. External access to resources is provided by a pair of SSH gateways. Departmental systems are backed up to tapes which are regularly shipped off-site for 3rd party vaulted storage. Tape backups are done using a pair of tape libraries with a combined 12 drives and a local storage capacity of 1.5 petabytes.</w:t>
+        <w:t>department has a dedicated data center with redundant cooling, UPS/Generator backed power, gas fire suppression, seismically braced racks, and key-card controlled access. We have a departmental IT support team of 7 professionals. External access to resources is provided by a pair of SSH gateways. Departmental systems are backed up to tapes which are regularly shipped off-site for 3rd party vaulted storage. Tape backups are done using a pair of tape libraries with a combined 12 drives and a local storage capacity of 1.5 petabytes.</w:t>
       </w:r>
       <w:r>
         <w:rPr>

</xml_diff>